<commit_message>
feat: add SPKP ADU (Adjustment Base) CRUD with orange/yellow badge and approve/reject
</commit_message>
<xml_diff>
--- a/blueprint/DRAFT_Blueprint_ERP_ProductionProcess_CWA.docx
+++ b/blueprint/DRAFT_Blueprint_ERP_ProductionProcess_CWA.docx
@@ -7750,6 +7750,62 @@
         </w:drawing>
       </w:r>
     </w:p>
+    <w:p>
+      <w:pPr>
+        <w:tabs>
+          <w:tab w:val="num" w:pos="2160"/>
+        </w:tabs>
+        <w:spacing w:line="360" w:lineRule="auto"/>
+        <w:ind w:left="1728"/>
+        <w:rPr>
+          <w:sz w:val="24"/>
+          <w:szCs w:val="24"/>
+          <w:lang w:val="en-US"/>
+        </w:rPr>
+      </w:pPr>
+      <w:r>
+        <w:rPr>
+          <w:sz w:val="24"/>
+          <w:szCs w:val="24"/>
+          <w:lang w:val="en-US"/>
+        </w:rPr>
+        <w:drawing>
+          <wp:inline distT="0" distB="0" distL="0" distR="0" wp14:anchorId="4F5254E8" wp14:editId="39E71A42">
+            <wp:extent cx="5478145" cy="3300005"/>
+            <wp:effectExtent l="0" t="0" r="8255" b="0"/>
+            <wp:docPr id="954903589" name="Picture 1"/>
+            <wp:cNvGraphicFramePr>
+              <a:graphicFrameLocks xmlns:a="http://schemas.openxmlformats.org/drawingml/2006/main" noChangeAspect="1"/>
+            </wp:cNvGraphicFramePr>
+            <a:graphic xmlns:a="http://schemas.openxmlformats.org/drawingml/2006/main">
+              <a:graphicData uri="http://schemas.openxmlformats.org/drawingml/2006/picture">
+                <pic:pic xmlns:pic="http://schemas.openxmlformats.org/drawingml/2006/picture">
+                  <pic:nvPicPr>
+                    <pic:cNvPr id="954903589" name=""/>
+                    <pic:cNvPicPr/>
+                  </pic:nvPicPr>
+                  <pic:blipFill>
+                    <a:blip r:embed="rId13"/>
+                    <a:stretch>
+                      <a:fillRect/>
+                    </a:stretch>
+                  </pic:blipFill>
+                  <pic:spPr>
+                    <a:xfrm>
+                      <a:off x="0" y="0"/>
+                      <a:ext cx="5482879" cy="3302856"/>
+                    </a:xfrm>
+                    <a:prstGeom prst="rect">
+                      <a:avLst/>
+                    </a:prstGeom>
+                  </pic:spPr>
+                </pic:pic>
+              </a:graphicData>
+            </a:graphic>
+          </wp:inline>
+        </w:drawing>
+      </w:r>
+    </w:p>
     <w:p/>
     <w:p>
       <w:pPr>
@@ -7918,6 +7974,7 @@
           <w:szCs w:val="24"/>
           <w:lang w:val="en-US"/>
         </w:rPr>
+        <w:lastRenderedPageBreak/>
         <w:t>Penjelasan UI:</w:t>
       </w:r>
       <w:r>
@@ -8014,6 +8071,169 @@
           <w:lang w:val="en-US"/>
         </w:rPr>
         <w:t>Edit memunculkan modal terisi untuk pembaruan data, Hapus memunculkan alert konfirmasi modal.</w:t>
+      </w:r>
+    </w:p>
+    <w:p>
+      <w:pPr>
+        <w:tabs>
+          <w:tab w:val="num" w:pos="2160"/>
+        </w:tabs>
+        <w:spacing w:line="360" w:lineRule="auto"/>
+        <w:ind w:left="1728"/>
+        <w:rPr>
+          <w:sz w:val="24"/>
+          <w:szCs w:val="24"/>
+          <w:lang w:val="en-US"/>
+        </w:rPr>
+      </w:pPr>
+      <w:r>
+        <w:rPr>
+          <w:noProof/>
+        </w:rPr>
+        <w:drawing>
+          <wp:inline distT="0" distB="0" distL="0" distR="0" wp14:anchorId="3A030AA1" wp14:editId="4392099B">
+            <wp:extent cx="5592445" cy="2528393"/>
+            <wp:effectExtent l="0" t="0" r="8255" b="5715"/>
+            <wp:docPr id="327618609" name="Picture 1"/>
+            <wp:cNvGraphicFramePr>
+              <a:graphicFrameLocks xmlns:a="http://schemas.openxmlformats.org/drawingml/2006/main" noChangeAspect="1"/>
+            </wp:cNvGraphicFramePr>
+            <a:graphic xmlns:a="http://schemas.openxmlformats.org/drawingml/2006/main">
+              <a:graphicData uri="http://schemas.openxmlformats.org/drawingml/2006/picture">
+                <pic:pic xmlns:pic="http://schemas.openxmlformats.org/drawingml/2006/picture">
+                  <pic:nvPicPr>
+                    <pic:cNvPr id="327618609" name=""/>
+                    <pic:cNvPicPr/>
+                  </pic:nvPicPr>
+                  <pic:blipFill>
+                    <a:blip r:embed="rId14"/>
+                    <a:stretch>
+                      <a:fillRect/>
+                    </a:stretch>
+                  </pic:blipFill>
+                  <pic:spPr>
+                    <a:xfrm>
+                      <a:off x="0" y="0"/>
+                      <a:ext cx="5597228" cy="2530555"/>
+                    </a:xfrm>
+                    <a:prstGeom prst="rect">
+                      <a:avLst/>
+                    </a:prstGeom>
+                  </pic:spPr>
+                </pic:pic>
+              </a:graphicData>
+            </a:graphic>
+          </wp:inline>
+        </w:drawing>
+      </w:r>
+    </w:p>
+    <w:p>
+      <w:pPr>
+        <w:tabs>
+          <w:tab w:val="num" w:pos="2160"/>
+        </w:tabs>
+        <w:spacing w:line="360" w:lineRule="auto"/>
+        <w:ind w:left="1728"/>
+        <w:rPr>
+          <w:sz w:val="24"/>
+          <w:szCs w:val="24"/>
+          <w:lang w:val="en-US"/>
+        </w:rPr>
+      </w:pPr>
+      <w:r>
+        <w:rPr>
+          <w:noProof/>
+        </w:rPr>
+        <w:drawing>
+          <wp:inline distT="0" distB="0" distL="0" distR="0" wp14:anchorId="33CE87FD" wp14:editId="6939249B">
+            <wp:extent cx="4963795" cy="3671399"/>
+            <wp:effectExtent l="0" t="0" r="8255" b="5715"/>
+            <wp:docPr id="473312104" name="Picture 1"/>
+            <wp:cNvGraphicFramePr>
+              <a:graphicFrameLocks xmlns:a="http://schemas.openxmlformats.org/drawingml/2006/main" noChangeAspect="1"/>
+            </wp:cNvGraphicFramePr>
+            <a:graphic xmlns:a="http://schemas.openxmlformats.org/drawingml/2006/main">
+              <a:graphicData uri="http://schemas.openxmlformats.org/drawingml/2006/picture">
+                <pic:pic xmlns:pic="http://schemas.openxmlformats.org/drawingml/2006/picture">
+                  <pic:nvPicPr>
+                    <pic:cNvPr id="473312104" name=""/>
+                    <pic:cNvPicPr/>
+                  </pic:nvPicPr>
+                  <pic:blipFill>
+                    <a:blip r:embed="rId15"/>
+                    <a:stretch>
+                      <a:fillRect/>
+                    </a:stretch>
+                  </pic:blipFill>
+                  <pic:spPr>
+                    <a:xfrm>
+                      <a:off x="0" y="0"/>
+                      <a:ext cx="4968494" cy="3674874"/>
+                    </a:xfrm>
+                    <a:prstGeom prst="rect">
+                      <a:avLst/>
+                    </a:prstGeom>
+                  </pic:spPr>
+                </pic:pic>
+              </a:graphicData>
+            </a:graphic>
+          </wp:inline>
+        </w:drawing>
+      </w:r>
+    </w:p>
+    <w:p>
+      <w:pPr>
+        <w:tabs>
+          <w:tab w:val="num" w:pos="2160"/>
+        </w:tabs>
+        <w:spacing w:line="360" w:lineRule="auto"/>
+        <w:ind w:left="1728"/>
+        <w:rPr>
+          <w:sz w:val="24"/>
+          <w:szCs w:val="24"/>
+          <w:lang w:val="en-US"/>
+        </w:rPr>
+      </w:pPr>
+      <w:r>
+        <w:rPr>
+          <w:noProof/>
+        </w:rPr>
+        <w:lastRenderedPageBreak/>
+        <w:drawing>
+          <wp:inline distT="0" distB="0" distL="0" distR="0" wp14:anchorId="461F0F00" wp14:editId="0E4CE5CE">
+            <wp:extent cx="5059045" cy="3334576"/>
+            <wp:effectExtent l="0" t="0" r="8255" b="0"/>
+            <wp:docPr id="1398625353" name="Picture 1"/>
+            <wp:cNvGraphicFramePr>
+              <a:graphicFrameLocks xmlns:a="http://schemas.openxmlformats.org/drawingml/2006/main" noChangeAspect="1"/>
+            </wp:cNvGraphicFramePr>
+            <a:graphic xmlns:a="http://schemas.openxmlformats.org/drawingml/2006/main">
+              <a:graphicData uri="http://schemas.openxmlformats.org/drawingml/2006/picture">
+                <pic:pic xmlns:pic="http://schemas.openxmlformats.org/drawingml/2006/picture">
+                  <pic:nvPicPr>
+                    <pic:cNvPr id="1398625353" name=""/>
+                    <pic:cNvPicPr/>
+                  </pic:nvPicPr>
+                  <pic:blipFill>
+                    <a:blip r:embed="rId16"/>
+                    <a:stretch>
+                      <a:fillRect/>
+                    </a:stretch>
+                  </pic:blipFill>
+                  <pic:spPr>
+                    <a:xfrm>
+                      <a:off x="0" y="0"/>
+                      <a:ext cx="5065440" cy="3338791"/>
+                    </a:xfrm>
+                    <a:prstGeom prst="rect">
+                      <a:avLst/>
+                    </a:prstGeom>
+                  </pic:spPr>
+                </pic:pic>
+              </a:graphicData>
+            </a:graphic>
+          </wp:inline>
+        </w:drawing>
       </w:r>
     </w:p>
     <w:p/>
@@ -8058,7 +8278,6 @@
           <w:szCs w:val="24"/>
           <w:lang w:val="en-US"/>
         </w:rPr>
-        <w:lastRenderedPageBreak/>
         <w:t xml:space="preserve">SPKP ADU (Surat Perintah Kerja Produksi Adjustment) </w:t>
       </w:r>
       <w:r>
@@ -8289,6 +8508,7 @@
         <w:spacing w:before="136"/>
       </w:pPr>
       <w:r>
+        <w:lastRenderedPageBreak/>
         <w:t>SPPBJ ADU</w:t>
       </w:r>
     </w:p>
@@ -8529,16 +8749,7 @@
           <w:szCs w:val="24"/>
           <w:lang w:val="en-US"/>
         </w:rPr>
-        <w:t xml:space="preserve">2. Data Grid Koreksi Takaran Warna : Detail Bahan Baku (Pasta/Pigmen Tambahan), </w:t>
-      </w:r>
-      <w:r>
-        <w:rPr>
-          <w:sz w:val="24"/>
-          <w:szCs w:val="24"/>
-          <w:lang w:val="en-US"/>
-        </w:rPr>
-        <w:lastRenderedPageBreak/>
-        <w:t>Required Qty, Actual Production Qty, Adjustment Qty, Realisasi (STBJ).</w:t>
+        <w:t>2. Data Grid Koreksi Takaran Warna : Detail Bahan Baku (Pasta/Pigmen Tambahan), Required Qty, Actual Production Qty, Adjustment Qty, Realisasi (STBJ).</w:t>
       </w:r>
     </w:p>
     <w:p>
@@ -8796,6 +9007,7 @@
           <w:szCs w:val="24"/>
           <w:lang w:val="en-US"/>
         </w:rPr>
+        <w:lastRenderedPageBreak/>
         <w:t>2. Detail Dosis &amp; Bahan : Material ID/Name (Aditif/Biosida/Insektisida), Target Dose Qty, Actual Dose Qty (Penimbangan Presisi), UOM, Mixing Time (Durasi Pengadukan), Operator Pelaksana.</w:t>
       </w:r>
     </w:p>
@@ -9016,16 +9228,7 @@
           <w:szCs w:val="24"/>
           <w:lang w:val="en-US"/>
         </w:rPr>
-        <w:t xml:space="preserve">Tampilan awal berupa table data grid menampilkan SPPPK_No, Date, No_Batch, </w:t>
-      </w:r>
-      <w:r>
-        <w:rPr>
-          <w:sz w:val="24"/>
-          <w:szCs w:val="24"/>
-          <w:lang w:val="en-US"/>
-        </w:rPr>
-        <w:lastRenderedPageBreak/>
-        <w:t>Product_Name, Packaging_Line_ID, Package_Type, Target_Packing_Qty_Pcs, Actual_Packed_Pcs, Status, dan Notes. Tombol Tambah memunculkan Pop-up Modal Form berstruktur:</w:t>
+        <w:t>Tampilan awal berupa table data grid menampilkan SPPPK_No, Date, No_Batch, Product_Name, Packaging_Line_ID, Package_Type, Target_Packing_Qty_Pcs, Actual_Packed_Pcs, Status, dan Notes. Tombol Tambah memunculkan Pop-up Modal Form berstruktur:</w:t>
       </w:r>
     </w:p>
     <w:p>

</xml_diff>